<commit_message>
Update schametic 1. Adding 7 DRAMS, 2. Replacing a SPD EEPROM with new one that is including in a temperature sensor, 3. modifying a DIMM Connector and DRAM PAD
</commit_message>
<xml_diff>
--- a/docs/프로젝트 사양서.docx
+++ b/docs/프로젝트 사양서.docx
@@ -5,7 +5,6 @@
     <w:p>
       <w:pPr>
         <w:rPr>
-          <w:rFonts w:hint="eastAsia"/>
           <w:b/>
           <w:bCs/>
           <w:sz w:val="60"/>
@@ -75,7 +74,6 @@
           <w:p>
             <w:pPr>
               <w:rPr>
-                <w:rFonts w:hint="eastAsia"/>
                 <w:b/>
                 <w:bCs/>
               </w:rPr>
@@ -184,30 +182,14 @@
             <w:hideMark/>
           </w:tcPr>
           <w:p>
-            <w:pPr>
+            <w:r>
+              <w:t>8GB</w:t>
+            </w:r>
+            <w:r>
               <w:rPr>
                 <w:rFonts w:hint="eastAsia"/>
               </w:rPr>
-            </w:pPr>
-            <w:r>
-              <w:t>8</w:t>
-            </w:r>
-            <w:proofErr w:type="gramStart"/>
-            <w:r>
-              <w:t>GB</w:t>
-            </w:r>
-            <w:r>
-              <w:rPr>
-                <w:rFonts w:hint="eastAsia"/>
-              </w:rPr>
-              <w:t>(</w:t>
-            </w:r>
-            <w:proofErr w:type="gramEnd"/>
-            <w:r>
-              <w:rPr>
-                <w:rFonts w:hint="eastAsia"/>
-              </w:rPr>
-              <w:t>8Gb x 8)</w:t>
+              <w:t>(8Gb x 8)</w:t>
             </w:r>
           </w:p>
         </w:tc>
@@ -272,13 +254,8 @@
             <w:hideMark/>
           </w:tcPr>
           <w:p>
-            <w:proofErr w:type="spellStart"/>
-            <w:r>
-              <w:t>비지원</w:t>
-            </w:r>
-            <w:proofErr w:type="spellEnd"/>
-            <w:r>
-              <w:t xml:space="preserve"> (Non-ECC)</w:t>
+            <w:r>
+              <w:t>비지원 (Non-ECC)</w:t>
             </w:r>
           </w:p>
         </w:tc>
@@ -425,7 +402,13 @@
           </w:tcPr>
           <w:p>
             <w:r>
-              <w:t>6 Layer 예상 (Power/GND 포함)</w:t>
+              <w:rPr>
+                <w:rFonts w:hint="eastAsia"/>
+              </w:rPr>
+              <w:t>8</w:t>
+            </w:r>
+            <w:r>
+              <w:t xml:space="preserve"> Layer (Power/GND 포함)</w:t>
             </w:r>
           </w:p>
         </w:tc>
@@ -589,21 +572,7 @@
         <w:rPr>
           <w:rFonts w:hint="eastAsia"/>
         </w:rPr>
-        <w:t xml:space="preserve"> - 비아 서계 최적화 및 </w:t>
-      </w:r>
-      <w:proofErr w:type="spellStart"/>
-      <w:r>
-        <w:rPr>
-          <w:rFonts w:hint="eastAsia"/>
-        </w:rPr>
-        <w:t>스텁</w:t>
-      </w:r>
-      <w:proofErr w:type="spellEnd"/>
-      <w:r>
-        <w:rPr>
-          <w:rFonts w:hint="eastAsia"/>
-        </w:rPr>
-        <w:t xml:space="preserve"> 영향 최소화</w:t>
+        <w:t xml:space="preserve"> - 비아 서계 최적화 및 스텁 영향 최소화</w:t>
       </w:r>
     </w:p>
     <w:p>
@@ -619,21 +588,7 @@
         <w:rPr>
           <w:rFonts w:hint="eastAsia"/>
         </w:rPr>
-        <w:t xml:space="preserve"> - 데이터, </w:t>
-      </w:r>
-      <w:proofErr w:type="spellStart"/>
-      <w:r>
-        <w:rPr>
-          <w:rFonts w:hint="eastAsia"/>
-        </w:rPr>
-        <w:t>스트로브</w:t>
-      </w:r>
-      <w:proofErr w:type="spellEnd"/>
-      <w:r>
-        <w:rPr>
-          <w:rFonts w:hint="eastAsia"/>
-        </w:rPr>
-        <w:t>, 클럭 그룹 간 정밀 길이 매칭</w:t>
+        <w:t xml:space="preserve"> - 데이터, 스트로브, 클럭 그룹 간 정밀 길이 매칭</w:t>
       </w:r>
     </w:p>
     <w:p>
@@ -662,11 +617,6 @@
       </w:r>
     </w:p>
     <w:p>
-      <w:pPr>
-        <w:rPr>
-          <w:rFonts w:hint="eastAsia"/>
-        </w:rPr>
-      </w:pPr>
       <w:r>
         <w:rPr>
           <w:rFonts w:hint="eastAsia"/>
@@ -1292,6 +1242,7 @@
   <w:style w:type="character" w:default="1" w:styleId="a0">
     <w:name w:val="Default Paragraph Font"/>
     <w:uiPriority w:val="1"/>
+    <w:semiHidden/>
     <w:unhideWhenUsed/>
   </w:style>
   <w:style w:type="table" w:default="1" w:styleId="a1">

</xml_diff>